<commit_message>
Update CarInfo manual test case
</commit_message>
<xml_diff>
--- a/input/carinfo-tests.docx
+++ b/input/carinfo-tests.docx
@@ -3,6 +3,55 @@
 <w:document xmlns:ve="http://schemas.openxmlformats.org/markup-compatibility/2006" xmlns:o="urn:schemas-microsoft-com:office:office" xmlns:r="http://schemas.openxmlformats.org/officeDocument/2006/relationships" xmlns:m="http://schemas.openxmlformats.org/officeDocument/2006/math" xmlns:v="urn:schemas-microsoft-com:vml" xmlns:wp="http://schemas.openxmlformats.org/drawingml/2006/wordprocessingDrawing" xmlns:w10="urn:schemas-microsoft-com:office:word" xmlns:w="http://schemas.openxmlformats.org/wordprocessingml/2006/main" xmlns:wne="http://schemas.microsoft.com/office/word/2006/wordml">
   <w:body>
     <w:p>
+      <w:pPr>
+        <w:rPr>
+          <w:b/>
+          <w:bCs/>
+        </w:rPr>
+      </w:pPr>
+      <w:r>
+        <w:rPr>
+          <w:b/>
+          <w:bCs/>
+        </w:rPr>
+        <w:t>Test Case ID: TC-CI-001</w:t>
+      </w:r>
+    </w:p>
+    <w:p>
+      <w:r>
+        <w:t xml:space="preserve">Title: Open </w:t>
+      </w:r>
+      <w:proofErr w:type="spellStart"/>
+      <w:r>
+        <w:t>CarInfo</w:t>
+      </w:r>
+      <w:proofErr w:type="spellEnd"/>
+      <w:r>
+        <w:t xml:space="preserve"> site and create account</w:t>
+      </w:r>
+    </w:p>
+    <w:p>
+      <w:r>
+        <w:t>Precondition: User has internet access</w:t>
+      </w:r>
+    </w:p>
+    <w:p>
+      <w:r>
+        <w:t>Steps:</w:t>
+      </w:r>
+    </w:p>
+    <w:p>
+      <w:proofErr w:type="gramStart"/>
+      <w:r>
+        <w:t>1.</w:t>
+      </w:r>
+      <w:r>
+        <w:t>Open</w:t>
+      </w:r>
+      <w:proofErr w:type="gramEnd"/>
+      <w:r>
+        <w:t xml:space="preserve"> </w:t>
+      </w:r>
       <w:r>
         <w:t>https://car.info/</w:t>
       </w:r>
@@ -10,6 +59,9 @@
     <w:p>
       <w:proofErr w:type="gramStart"/>
       <w:r>
+        <w:t>2.</w:t>
+      </w:r>
+      <w:r>
         <w:t>click</w:t>
       </w:r>
       <w:proofErr w:type="gramEnd"/>
@@ -18,58 +70,79 @@
       </w:r>
     </w:p>
     <w:p>
-      <w:r>
-        <w:t>Select Google</w:t>
-      </w:r>
-    </w:p>
-    <w:p>
-      <w:r>
-        <w:t>Enter username as karthikkmdec89@gmail.com and password as Test@123</w:t>
-      </w:r>
-    </w:p>
-    <w:p>
-      <w:r>
-        <w:t>If it further requests for access, click on Continue</w:t>
-      </w:r>
-    </w:p>
-    <w:p>
-      <w:r>
-        <w:t xml:space="preserve">If it requests to Approve term of </w:t>
-      </w:r>
       <w:proofErr w:type="gramStart"/>
       <w:r>
-        <w:t>use ,</w:t>
+        <w:t>3.</w:t>
+      </w:r>
+      <w:r>
+        <w:t>Select</w:t>
       </w:r>
       <w:proofErr w:type="gramEnd"/>
       <w:r>
-        <w:t xml:space="preserve"> then select </w:t>
-      </w:r>
-      <w:proofErr w:type="spellStart"/>
-      <w:r>
-        <w:t>Confiem</w:t>
-      </w:r>
-      <w:proofErr w:type="spellEnd"/>
-      <w:r>
-        <w:t xml:space="preserve"> </w:t>
-      </w:r>
-      <w:proofErr w:type="spellStart"/>
-      <w:r>
-        <w:t>teh</w:t>
-      </w:r>
-      <w:proofErr w:type="spellEnd"/>
+        <w:t xml:space="preserve"> Google</w:t>
+      </w:r>
+    </w:p>
+    <w:p>
+      <w:proofErr w:type="gramStart"/>
+      <w:r>
+        <w:t>4.</w:t>
+      </w:r>
+      <w:r>
+        <w:t>Enter</w:t>
+      </w:r>
+      <w:proofErr w:type="gramEnd"/>
+      <w:r>
+        <w:t xml:space="preserve"> username as karthikkmdec89@gmail.com and password as Test@123</w:t>
+      </w:r>
+    </w:p>
+    <w:p>
+      <w:proofErr w:type="gramStart"/>
+      <w:r>
+        <w:t>5.</w:t>
+      </w:r>
+      <w:r>
+        <w:t>If</w:t>
+      </w:r>
+      <w:proofErr w:type="gramEnd"/>
+      <w:r>
+        <w:t xml:space="preserve"> it further requests for access, click on Continue</w:t>
+      </w:r>
+    </w:p>
+    <w:p>
+      <w:proofErr w:type="gramStart"/>
+      <w:r>
+        <w:t>6.</w:t>
+      </w:r>
+      <w:r>
+        <w:t>If</w:t>
+      </w:r>
+      <w:proofErr w:type="gramEnd"/>
+      <w:r>
+        <w:t xml:space="preserve"> it requests to Approve term of use , then select </w:t>
+      </w:r>
+      <w:r>
+        <w:t>Confirm t</w:t>
+      </w:r>
+      <w:r>
+        <w:t>h</w:t>
+      </w:r>
+      <w:r>
+        <w:t>e</w:t>
+      </w:r>
       <w:r>
         <w:t xml:space="preserve"> terms of use and for user selection select Regular user and agree</w:t>
       </w:r>
     </w:p>
     <w:p>
       <w:r>
-        <w:t xml:space="preserve">In the search tab in </w:t>
-      </w:r>
-      <w:proofErr w:type="spellStart"/>
-      <w:r>
-        <w:t>teh</w:t>
-      </w:r>
-      <w:proofErr w:type="spellEnd"/>
+        <w:t>7.</w:t>
+      </w:r>
+      <w:r>
+        <w:t>In the search tab in th</w:t>
+      </w:r>
+      <w:r>
+        <w:t>e</w:t>
+      </w:r>
       <w:r>
         <w:t xml:space="preserve"> top, type KFG40L and search</w:t>
       </w:r>

</xml_diff>